<commit_message>
Clarify spark-defaults verification step
</commit_message>
<xml_diff>
--- a/odigoi/04_remote_spark_kubernetes.docx
+++ b/odigoi/04_remote_spark_kubernetes.docx
@@ -3808,7 +3808,7 @@
         <w:rPr>
           <w:rStyle w:val="NormalTok"/>
         </w:rPr>
-        <w:t xml:space="preserve"> hosts termi7.cslab.ece.ntua.gr</w:t>
+        <w:t xml:space="preserve"> ahostsv4 termi7.cslab.ece.ntua.gr</w:t>
       </w:r>
       <w:r>
         <w:br/>
@@ -3823,7 +3823,7 @@
         <w:rPr>
           <w:rStyle w:val="NormalTok"/>
         </w:rPr>
-        <w:t xml:space="preserve"> hosts hdfs-namenode.default.svc.cluster.local</w:t>
+        <w:t xml:space="preserve"> ahostsv4 hdfs-namenode.default.svc.cluster.local</w:t>
       </w:r>
       <w:r>
         <w:br/>
@@ -3863,6 +3863,41 @@
           <w:rStyle w:val="NormalTok"/>
         </w:rPr>
         <w:t xml:space="preserve"> get sa spark</w:t>
+      </w:r>
+    </w:p>
+    <w:p>
+      <w:pPr>
+        <w:pStyle w:val="FirstParagraph"/>
+      </w:pPr>
+      <w:r>
+        <w:t xml:space="preserve">Αν θες ένα γρήγορο check, προτίμησε το</w:t>
+      </w:r>
+      <w:r>
+        <w:t xml:space="preserve"> </w:t>
+      </w:r>
+      <w:r>
+        <w:rPr>
+          <w:rStyle w:val="VerbatimChar"/>
+        </w:rPr>
+        <w:t xml:space="preserve">ahostsv4</w:t>
+      </w:r>
+      <w:r>
+        <w:t xml:space="preserve">. Στο WSL το</w:t>
+      </w:r>
+      <w:r>
+        <w:t xml:space="preserve"> </w:t>
+      </w:r>
+      <w:r>
+        <w:rPr>
+          <w:rStyle w:val="VerbatimChar"/>
+        </w:rPr>
+        <w:t xml:space="preserve">getent hosts</w:t>
+      </w:r>
+      <w:r>
+        <w:t xml:space="preserve"> </w:t>
+      </w:r>
+      <w:r>
+        <w:t xml:space="preserve">μπορεί να αργεί αρκετά παρότι η επίλυση τελικά πετυχαίνει.</w:t>
       </w:r>
     </w:p>
     <w:p>
@@ -4406,7 +4441,7 @@
         <w:pStyle w:val="FirstParagraph"/>
       </w:pPr>
       <w:r>
-        <w:t xml:space="preserve">και βάλε:</w:t>
+        <w:t xml:space="preserve">και έλεγξε το παραγόμενο αρχείο:</w:t>
       </w:r>
     </w:p>
     <w:p>

</xml_diff>

<commit_message>
Clarify section 2 env wording
</commit_message>
<xml_diff>
--- a/odigoi/04_remote_spark_kubernetes.docx
+++ b/odigoi/04_remote_spark_kubernetes.docx
@@ -1125,7 +1125,81 @@
         <w:pStyle w:val="FirstParagraph"/>
       </w:pPr>
       <w:r>
-        <w:t xml:space="preserve">Βάλε μέσα:</w:t>
+        <w:t xml:space="preserve">Στο πάνω μέρος του αρχείου άλλαξε μόνο τη γραμμή:</w:t>
+      </w:r>
+    </w:p>
+    <w:p>
+      <w:pPr>
+        <w:pStyle w:val="SourceCode"/>
+      </w:pPr>
+      <w:r>
+        <w:rPr>
+          <w:rStyle w:val="BuiltInTok"/>
+        </w:rPr>
+        <w:t xml:space="preserve">export</w:t>
+      </w:r>
+      <w:r>
+        <w:rPr>
+          <w:rStyle w:val="NormalTok"/>
+        </w:rPr>
+        <w:t xml:space="preserve"> </w:t>
+      </w:r>
+      <w:r>
+        <w:rPr>
+          <w:rStyle w:val="VariableTok"/>
+        </w:rPr>
+        <w:t xml:space="preserve">DSML_USER=</w:t>
+      </w:r>
+      <w:r>
+        <w:rPr>
+          <w:rStyle w:val="StringTok"/>
+        </w:rPr>
+        <w:t xml:space="preserve">"your_dsml_username"</w:t>
+      </w:r>
+    </w:p>
+    <w:p>
+      <w:pPr>
+        <w:pStyle w:val="FirstParagraph"/>
+      </w:pPr>
+      <w:r>
+        <w:t xml:space="preserve">και βάλε το username που σου απέδωσε το εργαστήριο, π.χ.:</w:t>
+      </w:r>
+    </w:p>
+    <w:p>
+      <w:pPr>
+        <w:pStyle w:val="SourceCode"/>
+      </w:pPr>
+      <w:r>
+        <w:rPr>
+          <w:rStyle w:val="BuiltInTok"/>
+        </w:rPr>
+        <w:t xml:space="preserve">export</w:t>
+      </w:r>
+      <w:r>
+        <w:rPr>
+          <w:rStyle w:val="NormalTok"/>
+        </w:rPr>
+        <w:t xml:space="preserve"> </w:t>
+      </w:r>
+      <w:r>
+        <w:rPr>
+          <w:rStyle w:val="VariableTok"/>
+        </w:rPr>
+        <w:t xml:space="preserve">DSML_USER=</w:t>
+      </w:r>
+      <w:r>
+        <w:rPr>
+          <w:rStyle w:val="StringTok"/>
+        </w:rPr>
+        <w:t xml:space="preserve">"ikons"</w:t>
+      </w:r>
+    </w:p>
+    <w:p>
+      <w:pPr>
+        <w:pStyle w:val="FirstParagraph"/>
+      </w:pPr>
+      <w:r>
+        <w:t xml:space="preserve">Δεν χρειάζεται να το αντιγράψεις με το χέρι. Για έλεγχο, το αρχείο που αντέγραψες περιέχει:</w:t>
       </w:r>
     </w:p>
     <w:p>

</xml_diff>